<commit_message>
InfoQ CADEC article: three trims for headroom — CONORM paragraph, the layers lead, the sentences under Figure 1
Co-Authored-By: Claude Fable 5.1 <noreply@anthropic.com>
</commit_message>
<xml_diff>
--- a/docs/Group 3 – Reliability Layers Don't Make an LLM Right. They Tell You Which Answers to Trust.docx
+++ b/docs/Group 3 – Reliability Layers Don't Make an LLM Right. They Tell You Which Answers to Trust.docx
@@ -145,7 +145,7 @@
         <w:pStyle w:val="BodyText"/>
       </w:pPr>
       <w:r>
-        <w:t xml:space="preserve">A supervised system does far better. CONORM [5], fine-tuned on 875 of CADEC's 1,250 files, reaches an end-to-end F1 of 0.72 under lenient span matching. Our zero-shot extractor, everything it returns, reaches 0.47 to 0.50 under the same matching on our development split, 0.39 to 0.43 span-exact. We are not competing with it: it needs those 875 annotated files, and still cannot say which of its answers to trust. Our held-out split was spent once, 60 documents, one run; every other number is development-side and says so. Two things would move the absolute numbers: the judge is small, and CADEC, public since 2015, is almost certainly in its training data. The comparisons between layers should hold.</w:t>
+        <w:t xml:space="preserve">A supervised system does far better: CONORM [5], fine-tuned on 875 of CADEC's 1,250 files, reaches an end-to-end F1 of 0.72 under lenient span matching, against our zero-shot extractor's 0.47 to 0.50 on the development split (0.39 to 0.43 span-exact). We are not competing with it: it needs those annotated files, and still cannot say which of its answers to trust. Our held-out split was spent once, 60 documents, one run; every other number is development-side and says so. Two things would move the absolute numbers: the judge is small, and CADEC, public since 2015, is almost certainly in its training data. The comparisons between layers should hold.</w:t>
       </w:r>
     </w:p>
     <w:bookmarkEnd w:id="10"/>
@@ -234,7 +234,7 @@
         <w:pStyle w:val="BodyText"/>
       </w:pPr>
       <w:r>
-        <w:t xml:space="preserve">Behind the menu, a retriever with no model searches 227,554 keyword-to-code rows. Codes are written as</w:t>
+        <w:t xml:space="preserve">Behind the menu, a retriever with no model searches 227,554 keyword-to-code rows; codes are written as</w:t>
       </w:r>
       <w:r>
         <w:t xml:space="preserve"> </w:t>
@@ -249,7 +249,20 @@
         <w:t xml:space="preserve"> </w:t>
       </w:r>
       <w:r>
-        <w:t xml:space="preserve">|Drowsy|, SNOMED's bar notation, throughout.</w:t>
+        <w:t xml:space="preserve">|Drowsy|, SNOMED's bar notation, and F1 is</w:t>
+      </w:r>
+      <w:r>
+        <w:t xml:space="preserve"> </w:t>
+      </w:r>
+      <w:r>
+        <w:rPr>
+          <w:i/>
+          <w:iCs/>
+        </w:rPr>
+        <w:t xml:space="preserve">span-exact</w:t>
+      </w:r>
+      <w:r>
+        <w:t xml:space="preserve">, so a wrong boundary is both a false positive and a false negative.</w:t>
       </w:r>
     </w:p>
     <w:p>
@@ -340,30 +353,6 @@
       </w:r>
       <w:r>
         <w:t xml:space="preserve">on up to 38 percent of records, and of the codes it committed to, 13 to 18 percent exist in no SNOMED release.</w:t>
-      </w:r>
-    </w:p>
-    <w:p>
-      <w:pPr>
-        <w:pStyle w:val="BodyText"/>
-      </w:pPr>
-      <w:r>
-        <w:t xml:space="preserve">F1 is</w:t>
-      </w:r>
-      <w:r>
-        <w:t xml:space="preserve"> </w:t>
-      </w:r>
-      <w:r>
-        <w:rPr>
-          <w:i/>
-          <w:iCs/>
-        </w:rPr>
-        <w:t xml:space="preserve">span-exact</w:t>
-      </w:r>
-      <w:r>
-        <w:t xml:space="preserve"> </w:t>
-      </w:r>
-      <w:r>
-        <w:t xml:space="preserve">throughout: a wrong boundary is both a false positive and a false negative.</w:t>
       </w:r>
     </w:p>
     <w:p>
@@ -629,7 +618,7 @@
           <w:b/>
           <w:bCs/>
         </w:rPr>
-        <w:t xml:space="preserve">The two free layers did their jobs: the vocabulary check sorted the answers and refusal withheld the doubtful ones, and neither changed an answer. Of the three paid layers, self-correction almost never fired, voting did not help, and the judge worked but nothing read its verdict.</w:t>
+        <w:t xml:space="preserve">The two free layers sorted and withheld without changing an answer; of the three paid ones, self-correction almost never fired, voting did not help, and the judge worked but nothing read its verdict.</w:t>
       </w:r>
     </w:p>
     <w:p>

</xml_diff>

<commit_message>
InfoQ CADEC article: Figure 4's title centred on the figure, not the plot area
Co-Authored-By: Claude Fable 5.1 <noreply@anthropic.com>
</commit_message>
<xml_diff>
--- a/docs/Group 3 – Reliability Layers Don't Make an LLM Right. They Tell You Which Answers to Trust.docx
+++ b/docs/Group 3 – Reliability Layers Don't Make an LLM Right. They Tell You Which Answers to Trust.docx
@@ -981,7 +981,7 @@
       <w:r>
         <w:drawing>
           <wp:inline>
-            <wp:extent cx="5334000" cy="2037914"/>
+            <wp:extent cx="5334000" cy="2611027"/>
             <wp:effectExtent b="0" l="0" r="0" t="0"/>
             <wp:docPr descr="Figure 4" title="" id="25" name="Picture"/>
             <a:graphic>
@@ -1002,7 +1002,7 @@
                   <pic:spPr bwMode="auto">
                     <a:xfrm>
                       <a:off x="0" y="0"/>
-                      <a:ext cx="5334000" cy="2037914"/>
+                      <a:ext cx="5334000" cy="2611027"/>
                     </a:xfrm>
                     <a:prstGeom prst="rect">
                       <a:avLst/>

</xml_diff>

<commit_message>
InfoQ CADEC article: Figure 1 in two rows of three cards, output as its own card
Co-Authored-By: Claude Fable 5.1 <noreply@anthropic.com>
</commit_message>
<xml_diff>
--- a/docs/Group 3 – Reliability Layers Don't Make an LLM Right. They Tell You Which Answers to Trust.docx
+++ b/docs/Group 3 – Reliability Layers Don't Make an LLM Right. They Tell You Which Answers to Trust.docx
@@ -177,7 +177,7 @@
       <w:r>
         <w:drawing>
           <wp:inline>
-            <wp:extent cx="5334000" cy="1332240"/>
+            <wp:extent cx="5334000" cy="3571115"/>
             <wp:effectExtent b="0" l="0" r="0" t="0"/>
             <wp:docPr descr="Figure 1" title="" id="12" name="Picture"/>
             <a:graphic>
@@ -198,7 +198,7 @@
                   <pic:spPr bwMode="auto">
                     <a:xfrm>
                       <a:off x="0" y="0"/>
-                      <a:ext cx="5334000" cy="1332240"/>
+                      <a:ext cx="5334000" cy="3571115"/>
                     </a:xfrm>
                     <a:prstGeom prst="rect">
                       <a:avLst/>
@@ -226,7 +226,7 @@
           <w:i/>
           <w:iCs/>
         </w:rPr>
-        <w:t xml:space="preserve">Figure 1: The pipeline, left to right, on one illustrative post (CADEC is non-transferable). Teal: a model call; grey: deterministic code. Each card shows what that step produces for the example; a code appears for the first time in the last one. Image: the authors.</w:t>
+        <w:t xml:space="preserve">Figure 1: The pipeline, read left to right and then down, on one illustrative post (CADEC is non-transferable). Teal: a model call; grey: deterministic code. Each card shows what that step produces for the example; a code appears for the first time in the last one. Image: the authors.</w:t>
       </w:r>
     </w:p>
     <w:p>

</xml_diff>